<commit_message>
docs: add lab 2 report pdf and procmon trace log
</commit_message>
<xml_diff>
--- a/report/os-report-204-Горченко.docx
+++ b/report/os-report-204-Горченко.docx
@@ -76,7 +76,18 @@
           <w:sz w:val="28"/>
           <w:szCs w:val="28"/>
         </w:rPr>
-        <w:t xml:space="preserve"> N</w:t>
+        <w:t xml:space="preserve"> </w:t>
+      </w:r>
+      <w:r>
+        <w:rPr>
+          <w:rStyle w:val="ae"/>
+          <w:bCs/>
+          <w:i w:val="0"/>
+          <w:color w:val="auto"/>
+          <w:sz w:val="28"/>
+          <w:szCs w:val="28"/>
+        </w:rPr>
+        <w:t>2</w:t>
       </w:r>
       <w:r>
         <w:rPr>
@@ -118,12 +129,6 @@
         <w:gridCol w:w="2900"/>
       </w:tblGrid>
       <w:tr>
-        <w:tblPrEx>
-          <w:tblCellMar>
-            <w:top w:w="0" w:type="dxa"/>
-            <w:bottom w:w="0" w:type="dxa"/>
-          </w:tblCellMar>
-        </w:tblPrEx>
         <w:trPr>
           <w:jc w:val="right"/>
         </w:trPr>
@@ -204,12 +209,6 @@
         </w:tc>
       </w:tr>
       <w:tr>
-        <w:tblPrEx>
-          <w:tblCellMar>
-            <w:top w:w="0" w:type="dxa"/>
-            <w:bottom w:w="0" w:type="dxa"/>
-          </w:tblCellMar>
-        </w:tblPrEx>
         <w:trPr>
           <w:jc w:val="right"/>
         </w:trPr>
@@ -254,12 +253,6 @@
         </w:tc>
       </w:tr>
       <w:tr>
-        <w:tblPrEx>
-          <w:tblCellMar>
-            <w:top w:w="0" w:type="dxa"/>
-            <w:bottom w:w="0" w:type="dxa"/>
-          </w:tblCellMar>
-        </w:tblPrEx>
         <w:trPr>
           <w:jc w:val="right"/>
         </w:trPr>
@@ -304,12 +297,6 @@
         </w:tc>
       </w:tr>
       <w:tr>
-        <w:tblPrEx>
-          <w:tblCellMar>
-            <w:top w:w="0" w:type="dxa"/>
-            <w:bottom w:w="0" w:type="dxa"/>
-          </w:tblCellMar>
-        </w:tblPrEx>
         <w:trPr>
           <w:jc w:val="right"/>
         </w:trPr>
@@ -385,12 +372,6 @@
         </w:tc>
       </w:tr>
       <w:tr>
-        <w:tblPrEx>
-          <w:tblCellMar>
-            <w:top w:w="0" w:type="dxa"/>
-            <w:bottom w:w="0" w:type="dxa"/>
-          </w:tblCellMar>
-        </w:tblPrEx>
         <w:trPr>
           <w:jc w:val="right"/>
         </w:trPr>
@@ -488,7 +469,26 @@
           <w:sz w:val="24"/>
           <w:szCs w:val="24"/>
         </w:rPr>
-        <w:t>Приобритение</w:t>
+        <w:t>Приобр</w:t>
+      </w:r>
+      <w:proofErr w:type="spellEnd"/>
+      <w:r>
+        <w:rPr>
+          <w:rFonts w:ascii="Times New Roman" w:hAnsi="Times New Roman" w:cs="Times New Roman"/>
+          <w:sz w:val="24"/>
+          <w:szCs w:val="24"/>
+          <w:lang w:val="en-US"/>
+        </w:rPr>
+        <w:t>e</w:t>
+      </w:r>
+      <w:proofErr w:type="spellStart"/>
+      <w:r>
+        <w:rPr>
+          <w:rFonts w:ascii="Times New Roman" w:hAnsi="Times New Roman" w:cs="Times New Roman"/>
+          <w:sz w:val="24"/>
+          <w:szCs w:val="24"/>
+        </w:rPr>
+        <w:t>тение</w:t>
       </w:r>
       <w:proofErr w:type="spellEnd"/>
       <w:r>
@@ -537,21 +537,14 @@
           <w:b/>
           <w:bCs/>
         </w:rPr>
-        <w:t>З</w:t>
-      </w:r>
+        <w:t>Задание</w:t>
+      </w:r>
+      <w:proofErr w:type="gramStart"/>
       <w:r>
         <w:rPr>
           <w:b/>
           <w:bCs/>
         </w:rPr>
-        <w:t>адание</w:t>
-      </w:r>
-      <w:proofErr w:type="gramStart"/>
-      <w:r>
-        <w:rPr>
-          <w:b/>
-          <w:bCs/>
-        </w:rPr>
         <w:t>:</w:t>
       </w:r>
       <w:r>
@@ -562,31 +555,7 @@
       </w:r>
       <w:proofErr w:type="gramEnd"/>
       <w:r>
-        <w:t xml:space="preserve"> и отладить программу на языке Си, осуществляющую работу с процессами и</w:t>
-      </w:r>
-      <w:r>
-        <w:t xml:space="preserve"> </w:t>
-      </w:r>
-      <w:r>
-        <w:t>взаимодействие между ними в одной из двух операционных систем. В результате работы</w:t>
-      </w:r>
-      <w:r>
-        <w:t xml:space="preserve"> </w:t>
-      </w:r>
-      <w:r>
-        <w:t>программа (основной процесс) должен создать для решение задачи один или несколько</w:t>
-      </w:r>
-      <w:r>
-        <w:t xml:space="preserve"> </w:t>
-      </w:r>
-      <w:r>
-        <w:t>дочерних процессов. Взаимодействие между процессами осуществляется через системные</w:t>
-      </w:r>
-      <w:r>
-        <w:t xml:space="preserve"> </w:t>
-      </w:r>
-      <w:r>
-        <w:t>сигналы/события и/или каналы (</w:t>
+        <w:t xml:space="preserve"> и отладить программу на языке Си, осуществляющую работу с процессами и взаимодействие между ними в одной из двух операционных систем. В результате работы программа (основной процесс) должен создать для решение задачи один или несколько дочерних процессов. Взаимодействие между процессами осуществляется через системные сигналы/события и/или каналы (</w:t>
       </w:r>
       <w:proofErr w:type="spellStart"/>
       <w:r>
@@ -594,13 +563,7 @@
       </w:r>
       <w:proofErr w:type="spellEnd"/>
       <w:r>
-        <w:t>).</w:t>
-      </w:r>
-      <w:r>
-        <w:t xml:space="preserve"> </w:t>
-      </w:r>
-      <w:r>
-        <w:t>Необходимо обрабатывать системные ошибки, которые могут возникнуть в результате работы.</w:t>
+        <w:t>). Необходимо обрабатывать системные ошибки, которые могут возникнуть в результате работы.</w:t>
       </w:r>
     </w:p>
     <w:p>
@@ -638,6 +601,8 @@
       <w:r>
         <w:t>вида:«</w:t>
       </w:r>
+      <w:bookmarkStart w:id="0" w:name="_GoBack"/>
+      <w:bookmarkEnd w:id="0"/>
       <w:proofErr w:type="gramEnd"/>
       <w:r>
         <w:t>число</w:t>
@@ -652,30 +617,9 @@
       </w:r>
       <w:proofErr w:type="spellEnd"/>
       <w:r>
-        <w:t>&gt;». Дочерний процесс</w:t>
-      </w:r>
-      <w:r>
-        <w:t xml:space="preserve"> </w:t>
-      </w:r>
-      <w:r>
-        <w:t>производит деление первого числа команда, на последующие числа в команде, а результат</w:t>
-      </w:r>
-      <w:r>
-        <w:t xml:space="preserve"> </w:t>
-      </w:r>
-      <w:r>
-        <w:t>выводит в стандартный поток вывода. Если происходит деление на 0, то тогда дочерний и</w:t>
-      </w:r>
-      <w:r>
-        <w:t xml:space="preserve"> </w:t>
-      </w:r>
-      <w:r>
-        <w:t>родительский процесс завершают свою работу. Проверка деления на 0 должна осуществляться на</w:t>
-      </w:r>
-      <w:r>
-        <w:rPr>
-          <w:lang w:val="en-US"/>
-        </w:rPr>
+        <w:t>&gt;». Дочерний процесс производит деление первого числа команда, на последующие числа в команде, а результат выводит в стандартный поток вывода. Если происходит деление на 0, то тогда дочерний и родительский процесс завершают свою работу. Проверка деления на 0 должна осуществляться на</w:t>
+      </w:r>
+      <w:r>
         <w:t xml:space="preserve"> </w:t>
       </w:r>
       <w:r>
@@ -695,17 +639,14 @@
         <w:pStyle w:val="1"/>
       </w:pPr>
       <w:r>
-        <w:t xml:space="preserve">Метод </w:t>
-      </w:r>
-      <w:proofErr w:type="spellStart"/>
-      <w:r>
-        <w:t>решения</w:t>
+        <w:t>Метод решения</w:t>
       </w:r>
     </w:p>
     <w:p>
       <w:pPr>
         <w:pStyle w:val="af0"/>
       </w:pPr>
+      <w:proofErr w:type="spellStart"/>
       <w:r>
         <w:t>Архитекутра</w:t>
       </w:r>
@@ -790,19 +731,7 @@
         <w:rPr>
           <w:b w:val="0"/>
         </w:rPr>
-        <w:t>Родительский процесс создаёт анонимный канал</w:t>
-      </w:r>
-      <w:r>
-        <w:rPr>
-          <w:b w:val="0"/>
-        </w:rPr>
-        <w:t xml:space="preserve">, </w:t>
-      </w:r>
-      <w:r>
-        <w:rPr>
-          <w:b w:val="0"/>
-        </w:rPr>
-        <w:t>перенаправляет стандартные потоки ввода-вывода дочерней программы, передаёт входные данные из файла, считывает результат работы из канала порциями в буфер и выполняет корректную синхронизацию с освобождением ресурсов ядра.</w:t>
+        <w:t>Родительский процесс создаёт анонимный канал, перенаправляет стандартные потоки ввода-вывода дочерней программы, передаёт входные данные из файла, считывает результат работы из канала порциями в буфер и выполняет корректную синхронизацию с освобождением ресурсов ядра.</w:t>
       </w:r>
     </w:p>
     <w:p>
@@ -845,12 +774,6 @@
         <w:gridCol w:w="6426"/>
       </w:tblGrid>
       <w:tr>
-        <w:tblPrEx>
-          <w:tblCellMar>
-            <w:top w:w="0" w:type="dxa"/>
-            <w:bottom w:w="0" w:type="dxa"/>
-          </w:tblCellMar>
-        </w:tblPrEx>
         <w:trPr>
           <w:tblHeader/>
         </w:trPr>
@@ -908,12 +831,6 @@
         </w:tc>
       </w:tr>
       <w:tr>
-        <w:tblPrEx>
-          <w:tblCellMar>
-            <w:top w:w="0" w:type="dxa"/>
-            <w:bottom w:w="0" w:type="dxa"/>
-          </w:tblCellMar>
-        </w:tblPrEx>
         <w:trPr>
           <w:cantSplit/>
         </w:trPr>
@@ -966,12 +883,6 @@
         </w:tc>
       </w:tr>
       <w:tr>
-        <w:tblPrEx>
-          <w:tblCellMar>
-            <w:top w:w="0" w:type="dxa"/>
-            <w:bottom w:w="0" w:type="dxa"/>
-          </w:tblCellMar>
-        </w:tblPrEx>
         <w:trPr>
           <w:cantSplit/>
         </w:trPr>
@@ -1016,9 +927,6 @@
             <w:pPr>
               <w:spacing w:after="0"/>
               <w:jc w:val="left"/>
-              <w:rPr>
-                <w:lang w:val="en-US"/>
-              </w:rPr>
             </w:pPr>
             <w:r>
               <w:t>Дочерний процесс – читает переданные данные из перенаправленного стандартного ввода и осуществляет их вывод</w:t>
@@ -1027,12 +935,6 @@
         </w:tc>
       </w:tr>
       <w:tr>
-        <w:tblPrEx>
-          <w:tblCellMar>
-            <w:top w:w="0" w:type="dxa"/>
-            <w:bottom w:w="0" w:type="dxa"/>
-          </w:tblCellMar>
-        </w:tblPrEx>
         <w:trPr>
           <w:cantSplit/>
         </w:trPr>
@@ -1109,13 +1011,7 @@
         <w:rPr>
           <w:b/>
         </w:rPr>
-        <w:t>ипы данных и структуры ядра</w:t>
-      </w:r>
-      <w:r>
-        <w:rPr>
-          <w:b/>
-        </w:rPr>
-        <w:t>:</w:t>
+        <w:t>ипы данных и структуры ядра:</w:t>
       </w:r>
     </w:p>
     <w:p>
@@ -1197,23 +1093,7 @@
           <w:sz w:val="22"/>
           <w:szCs w:val="22"/>
         </w:rPr>
-        <w:t xml:space="preserve"> параметры безопасности</w:t>
-      </w:r>
-      <w:r>
-        <w:rPr>
-          <w:b w:val="0"/>
-          <w:sz w:val="22"/>
-          <w:szCs w:val="22"/>
-        </w:rPr>
-        <w:t xml:space="preserve">, </w:t>
-      </w:r>
-      <w:r>
-        <w:rPr>
-          <w:b w:val="0"/>
-          <w:sz w:val="22"/>
-          <w:szCs w:val="22"/>
-        </w:rPr>
-        <w:t xml:space="preserve">включает наследование дескрипторов дочерним </w:t>
+        <w:t xml:space="preserve"> параметры безопасности, включает наследование дескрипторов дочерним </w:t>
       </w:r>
       <w:proofErr w:type="gramStart"/>
       <w:r>
@@ -1276,23 +1156,7 @@
           <w:sz w:val="22"/>
           <w:szCs w:val="22"/>
         </w:rPr>
-        <w:t xml:space="preserve"> конфигурация запуска</w:t>
-      </w:r>
-      <w:r>
-        <w:rPr>
-          <w:b w:val="0"/>
-          <w:sz w:val="22"/>
-          <w:szCs w:val="22"/>
-        </w:rPr>
-        <w:t>,</w:t>
-      </w:r>
-      <w:r>
-        <w:rPr>
-          <w:b w:val="0"/>
-          <w:sz w:val="22"/>
-          <w:szCs w:val="22"/>
-        </w:rPr>
-        <w:t xml:space="preserve"> перенаправляет стандартные потоки ввода-вывода потомка. </w:t>
+        <w:t xml:space="preserve"> конфигурация запуска, перенаправляет стандартные потоки ввода-вывода потомка. </w:t>
       </w:r>
     </w:p>
     <w:p>
@@ -1542,10 +1406,7 @@
         <w:t>()</w:t>
       </w:r>
       <w:r>
-        <w:t xml:space="preserve"> и выводит его в консоль</w:t>
-      </w:r>
-      <w:r>
-        <w:t>.</w:t>
+        <w:t xml:space="preserve"> и выводит его в консоль.</w:t>
       </w:r>
     </w:p>
     <w:p>
@@ -1662,12 +1523,6 @@
         <w:gridCol w:w="5726"/>
       </w:tblGrid>
       <w:tr>
-        <w:tblPrEx>
-          <w:tblCellMar>
-            <w:top w:w="0" w:type="dxa"/>
-            <w:bottom w:w="0" w:type="dxa"/>
-          </w:tblCellMar>
-        </w:tblPrEx>
         <w:trPr>
           <w:tblHeader/>
         </w:trPr>
@@ -1725,12 +1580,6 @@
         </w:tc>
       </w:tr>
       <w:tr>
-        <w:tblPrEx>
-          <w:tblCellMar>
-            <w:top w:w="0" w:type="dxa"/>
-            <w:bottom w:w="0" w:type="dxa"/>
-          </w:tblCellMar>
-        </w:tblPrEx>
         <w:trPr>
           <w:cantSplit/>
         </w:trPr>
@@ -1789,12 +1638,6 @@
         </w:tc>
       </w:tr>
       <w:tr>
-        <w:tblPrEx>
-          <w:tblCellMar>
-            <w:top w:w="0" w:type="dxa"/>
-            <w:bottom w:w="0" w:type="dxa"/>
-          </w:tblCellMar>
-        </w:tblPrEx>
         <w:trPr>
           <w:cantSplit/>
         </w:trPr>
@@ -1844,12 +1687,6 @@
         </w:tc>
       </w:tr>
       <w:tr>
-        <w:tblPrEx>
-          <w:tblCellMar>
-            <w:top w:w="0" w:type="dxa"/>
-            <w:bottom w:w="0" w:type="dxa"/>
-          </w:tblCellMar>
-        </w:tblPrEx>
         <w:trPr>
           <w:cantSplit/>
         </w:trPr>
@@ -1911,12 +1748,6 @@
         </w:tc>
       </w:tr>
       <w:tr>
-        <w:tblPrEx>
-          <w:tblCellMar>
-            <w:top w:w="0" w:type="dxa"/>
-            <w:bottom w:w="0" w:type="dxa"/>
-          </w:tblCellMar>
-        </w:tblPrEx>
         <w:trPr>
           <w:cantSplit/>
         </w:trPr>
@@ -1960,21 +1791,12 @@
               <w:jc w:val="left"/>
             </w:pPr>
             <w:r>
-              <w:t>Чтение</w:t>
-            </w:r>
-            <w:r>
-              <w:t xml:space="preserve"> выходных данных из читающего конца канала до появления сигнала EOF</w:t>
+              <w:t>Чтение выходных данных из читающего конца канала до появления сигнала EOF</w:t>
             </w:r>
           </w:p>
         </w:tc>
       </w:tr>
       <w:tr>
-        <w:tblPrEx>
-          <w:tblCellMar>
-            <w:top w:w="0" w:type="dxa"/>
-            <w:bottom w:w="0" w:type="dxa"/>
-          </w:tblCellMar>
-        </w:tblPrEx>
         <w:trPr>
           <w:cantSplit/>
         </w:trPr>
@@ -2018,21 +1840,12 @@
               <w:jc w:val="left"/>
             </w:pPr>
             <w:r>
-              <w:t>Б</w:t>
-            </w:r>
-            <w:r>
-              <w:t>локирующее ожидание полного завершения выполнения дочернего процесса.</w:t>
+              <w:t>Блокирующее ожидание полного завершения выполнения дочернего процесса.</w:t>
             </w:r>
           </w:p>
         </w:tc>
       </w:tr>
       <w:tr>
-        <w:tblPrEx>
-          <w:tblCellMar>
-            <w:top w:w="0" w:type="dxa"/>
-            <w:bottom w:w="0" w:type="dxa"/>
-          </w:tblCellMar>
-        </w:tblPrEx>
         <w:trPr>
           <w:cantSplit/>
         </w:trPr>
@@ -2082,12 +1895,6 @@
         </w:tc>
       </w:tr>
       <w:tr>
-        <w:tblPrEx>
-          <w:tblCellMar>
-            <w:top w:w="0" w:type="dxa"/>
-            <w:bottom w:w="0" w:type="dxa"/>
-          </w:tblCellMar>
-        </w:tblPrEx>
         <w:trPr>
           <w:cantSplit/>
         </w:trPr>
@@ -2227,6 +2034,9 @@
     <w:p>
       <w:pPr>
         <w:pStyle w:val="ad"/>
+        <w:rPr>
+          <w:lang w:val="en-US"/>
+        </w:rPr>
       </w:pPr>
       <w:proofErr w:type="spellStart"/>
       <w:proofErr w:type="gramStart"/>
@@ -2238,10 +2048,16 @@
       </w:r>
       <w:proofErr w:type="spellEnd"/>
       <w:r>
+        <w:rPr>
+          <w:lang w:val="en-US"/>
+        </w:rPr>
         <w:t>(</w:t>
       </w:r>
       <w:proofErr w:type="gramEnd"/>
       <w:r>
+        <w:rPr>
+          <w:lang w:val="en-US"/>
+        </w:rPr>
         <w:t>&amp;</w:t>
       </w:r>
       <w:proofErr w:type="spellStart"/>
@@ -2253,6 +2069,9 @@
       </w:r>
       <w:proofErr w:type="spellEnd"/>
       <w:r>
+        <w:rPr>
+          <w:lang w:val="en-US"/>
+        </w:rPr>
         <w:t>, &amp;</w:t>
       </w:r>
       <w:proofErr w:type="spellStart"/>
@@ -2264,6 +2083,9 @@
       </w:r>
       <w:proofErr w:type="spellEnd"/>
       <w:r>
+        <w:rPr>
+          <w:lang w:val="en-US"/>
+        </w:rPr>
         <w:t>, &amp;</w:t>
       </w:r>
       <w:proofErr w:type="spellStart"/>
@@ -2275,6 +2097,9 @@
       </w:r>
       <w:proofErr w:type="spellEnd"/>
       <w:r>
+        <w:rPr>
+          <w:lang w:val="en-US"/>
+        </w:rPr>
         <w:t>, 0);</w:t>
       </w:r>
     </w:p>
@@ -2479,6 +2304,9 @@
     <w:p>
       <w:pPr>
         <w:pStyle w:val="ad"/>
+        <w:rPr>
+          <w:lang w:val="en-US"/>
+        </w:rPr>
       </w:pPr>
     </w:p>
     <w:p>
@@ -2523,6 +2351,348 @@
           <w:lang w:val="en-US"/>
         </w:rPr>
         <w:t>, &amp;pi);</w:t>
+      </w:r>
+    </w:p>
+    <w:p>
+      <w:pPr>
+        <w:spacing w:after="120"/>
+        <w:rPr>
+          <w:lang w:val="en-US"/>
+        </w:rPr>
+      </w:pPr>
+    </w:p>
+    <w:p>
+      <w:pPr>
+        <w:spacing w:after="120"/>
+        <w:rPr>
+          <w:bCs/>
+        </w:rPr>
+      </w:pPr>
+      <w:r>
+        <w:rPr>
+          <w:b/>
+          <w:bCs/>
+        </w:rPr>
+        <w:t>Листинг 2</w:t>
+      </w:r>
+      <w:r>
+        <w:rPr>
+          <w:b/>
+          <w:bCs/>
+        </w:rPr>
+        <w:t xml:space="preserve"> -</w:t>
+      </w:r>
+      <w:r>
+        <w:rPr>
+          <w:b/>
+          <w:bCs/>
+        </w:rPr>
+        <w:t xml:space="preserve"> </w:t>
+      </w:r>
+      <w:r>
+        <w:rPr>
+          <w:bCs/>
+        </w:rPr>
+        <w:t>Закрытие дескрипторов записи и потоковое чтение (</w:t>
+      </w:r>
+      <w:proofErr w:type="spellStart"/>
+      <w:r>
+        <w:rPr>
+          <w:bCs/>
+        </w:rPr>
+        <w:t>parent.c</w:t>
+      </w:r>
+      <w:proofErr w:type="spellEnd"/>
+      <w:r>
+        <w:rPr>
+          <w:bCs/>
+        </w:rPr>
+        <w:t>)</w:t>
+      </w:r>
+    </w:p>
+    <w:p>
+      <w:pPr>
+        <w:pStyle w:val="ad"/>
+        <w:rPr>
+          <w:lang w:val="en-US"/>
+        </w:rPr>
+      </w:pPr>
+      <w:proofErr w:type="spellStart"/>
+      <w:proofErr w:type="gramStart"/>
+      <w:r>
+        <w:rPr>
+          <w:lang w:val="en-US"/>
+        </w:rPr>
+        <w:t>CloseHandle</w:t>
+      </w:r>
+      <w:proofErr w:type="spellEnd"/>
+      <w:r>
+        <w:rPr>
+          <w:lang w:val="en-US"/>
+        </w:rPr>
+        <w:t>(</w:t>
+      </w:r>
+      <w:proofErr w:type="spellStart"/>
+      <w:proofErr w:type="gramEnd"/>
+      <w:r>
+        <w:rPr>
+          <w:lang w:val="en-US"/>
+        </w:rPr>
+        <w:t>InputFile</w:t>
+      </w:r>
+      <w:proofErr w:type="spellEnd"/>
+      <w:r>
+        <w:rPr>
+          <w:lang w:val="en-US"/>
+        </w:rPr>
+        <w:t xml:space="preserve">); </w:t>
+      </w:r>
+    </w:p>
+    <w:p>
+      <w:pPr>
+        <w:pStyle w:val="ad"/>
+        <w:rPr>
+          <w:lang w:val="en-US"/>
+        </w:rPr>
+      </w:pPr>
+      <w:proofErr w:type="spellStart"/>
+      <w:r>
+        <w:rPr>
+          <w:lang w:val="en-US"/>
+        </w:rPr>
+        <w:t>CloseHandle</w:t>
+      </w:r>
+      <w:proofErr w:type="spellEnd"/>
+      <w:r>
+        <w:rPr>
+          <w:lang w:val="en-US"/>
+        </w:rPr>
+        <w:t>(</w:t>
+      </w:r>
+      <w:proofErr w:type="spellStart"/>
+      <w:r>
+        <w:rPr>
+          <w:lang w:val="en-US"/>
+        </w:rPr>
+        <w:t>pipeWrite</w:t>
+      </w:r>
+      <w:proofErr w:type="spellEnd"/>
+      <w:r>
+        <w:rPr>
+          <w:lang w:val="en-US"/>
+        </w:rPr>
+        <w:t>);</w:t>
+      </w:r>
+    </w:p>
+    <w:p>
+      <w:pPr>
+        <w:pStyle w:val="ad"/>
+        <w:rPr>
+          <w:lang w:val="en-US"/>
+        </w:rPr>
+      </w:pPr>
+    </w:p>
+    <w:p>
+      <w:pPr>
+        <w:pStyle w:val="ad"/>
+        <w:rPr>
+          <w:lang w:val="en-US"/>
+        </w:rPr>
+      </w:pPr>
+      <w:proofErr w:type="spellStart"/>
+      <w:r>
+        <w:rPr>
+          <w:lang w:val="en-US"/>
+        </w:rPr>
+        <w:t>printf</w:t>
+      </w:r>
+      <w:proofErr w:type="spellEnd"/>
+      <w:r>
+        <w:rPr>
+          <w:lang w:val="en-US"/>
+        </w:rPr>
+        <w:t>("Results:\n");</w:t>
+      </w:r>
+    </w:p>
+    <w:p>
+      <w:pPr>
+        <w:pStyle w:val="ad"/>
+        <w:rPr>
+          <w:lang w:val="en-US"/>
+        </w:rPr>
+      </w:pPr>
+      <w:r>
+        <w:rPr>
+          <w:lang w:val="en-US"/>
+        </w:rPr>
+        <w:t>while (</w:t>
+      </w:r>
+      <w:proofErr w:type="spellStart"/>
+      <w:proofErr w:type="gramStart"/>
+      <w:r>
+        <w:rPr>
+          <w:lang w:val="en-US"/>
+        </w:rPr>
+        <w:t>ReadFile</w:t>
+      </w:r>
+      <w:proofErr w:type="spellEnd"/>
+      <w:r>
+        <w:rPr>
+          <w:lang w:val="en-US"/>
+        </w:rPr>
+        <w:t>(</w:t>
+      </w:r>
+      <w:proofErr w:type="spellStart"/>
+      <w:proofErr w:type="gramEnd"/>
+      <w:r>
+        <w:rPr>
+          <w:lang w:val="en-US"/>
+        </w:rPr>
+        <w:t>pipeRead</w:t>
+      </w:r>
+      <w:proofErr w:type="spellEnd"/>
+      <w:r>
+        <w:rPr>
+          <w:lang w:val="en-US"/>
+        </w:rPr>
+        <w:t xml:space="preserve">, buffer, </w:t>
+      </w:r>
+      <w:proofErr w:type="spellStart"/>
+      <w:r>
+        <w:rPr>
+          <w:lang w:val="en-US"/>
+        </w:rPr>
+        <w:t>sizeof</w:t>
+      </w:r>
+      <w:proofErr w:type="spellEnd"/>
+      <w:r>
+        <w:rPr>
+          <w:lang w:val="en-US"/>
+        </w:rPr>
+        <w:t>(buffer) - 1, &amp;</w:t>
+      </w:r>
+      <w:proofErr w:type="spellStart"/>
+      <w:r>
+        <w:rPr>
+          <w:lang w:val="en-US"/>
+        </w:rPr>
+        <w:t>bytesRead</w:t>
+      </w:r>
+      <w:proofErr w:type="spellEnd"/>
+      <w:r>
+        <w:rPr>
+          <w:lang w:val="en-US"/>
+        </w:rPr>
+        <w:t>, NULL)) {</w:t>
+      </w:r>
+    </w:p>
+    <w:p>
+      <w:pPr>
+        <w:pStyle w:val="ad"/>
+        <w:rPr>
+          <w:lang w:val="en-US"/>
+        </w:rPr>
+      </w:pPr>
+      <w:r>
+        <w:rPr>
+          <w:lang w:val="en-US"/>
+        </w:rPr>
+        <w:t xml:space="preserve">    if (</w:t>
+      </w:r>
+      <w:proofErr w:type="spellStart"/>
+      <w:r>
+        <w:rPr>
+          <w:lang w:val="en-US"/>
+        </w:rPr>
+        <w:t>bytesRead</w:t>
+      </w:r>
+      <w:proofErr w:type="spellEnd"/>
+      <w:r>
+        <w:rPr>
+          <w:lang w:val="en-US"/>
+        </w:rPr>
+        <w:t xml:space="preserve"> == 0) break;</w:t>
+      </w:r>
+    </w:p>
+    <w:p>
+      <w:pPr>
+        <w:pStyle w:val="ad"/>
+        <w:rPr>
+          <w:lang w:val="en-US"/>
+        </w:rPr>
+      </w:pPr>
+      <w:r>
+        <w:rPr>
+          <w:lang w:val="en-US"/>
+        </w:rPr>
+        <w:t xml:space="preserve">    buffer[</w:t>
+      </w:r>
+      <w:proofErr w:type="spellStart"/>
+      <w:r>
+        <w:rPr>
+          <w:lang w:val="en-US"/>
+        </w:rPr>
+        <w:t>bytesRead</w:t>
+      </w:r>
+      <w:proofErr w:type="spellEnd"/>
+      <w:r>
+        <w:rPr>
+          <w:lang w:val="en-US"/>
+        </w:rPr>
+        <w:t>] = '\0';</w:t>
+      </w:r>
+    </w:p>
+    <w:p>
+      <w:pPr>
+        <w:pStyle w:val="ad"/>
+      </w:pPr>
+      <w:r>
+        <w:rPr>
+          <w:lang w:val="en-US"/>
+        </w:rPr>
+        <w:t xml:space="preserve">    </w:t>
+      </w:r>
+      <w:proofErr w:type="spellStart"/>
+      <w:proofErr w:type="gramStart"/>
+      <w:r>
+        <w:rPr>
+          <w:lang w:val="en-US"/>
+        </w:rPr>
+        <w:t>printf</w:t>
+      </w:r>
+      <w:proofErr w:type="spellEnd"/>
+      <w:r>
+        <w:t>(</w:t>
+      </w:r>
+      <w:proofErr w:type="gramEnd"/>
+      <w:r>
+        <w:t>"%</w:t>
+      </w:r>
+      <w:r>
+        <w:rPr>
+          <w:lang w:val="en-US"/>
+        </w:rPr>
+        <w:t>s</w:t>
+      </w:r>
+      <w:r>
+        <w:t xml:space="preserve">", </w:t>
+      </w:r>
+      <w:r>
+        <w:rPr>
+          <w:lang w:val="en-US"/>
+        </w:rPr>
+        <w:t>buffer</w:t>
+      </w:r>
+      <w:r>
+        <w:t>);</w:t>
+      </w:r>
+    </w:p>
+    <w:p>
+      <w:pPr>
+        <w:pStyle w:val="ad"/>
+      </w:pPr>
+      <w:r>
+        <w:t>}</w:t>
       </w:r>
     </w:p>
     <w:p>
@@ -2533,49 +2703,25 @@
     <w:p>
       <w:pPr>
         <w:spacing w:after="120"/>
-        <w:rPr>
-          <w:bCs/>
-        </w:rPr>
       </w:pPr>
       <w:r>
         <w:rPr>
           <w:b/>
-          <w:bCs/>
-        </w:rPr>
-        <w:t>Листинг 2</w:t>
-      </w:r>
-      <w:r>
-        <w:rPr>
-          <w:b/>
-          <w:bCs/>
-        </w:rPr>
-        <w:t xml:space="preserve"> -</w:t>
-      </w:r>
-      <w:r>
-        <w:rPr>
-          <w:b/>
-          <w:bCs/>
-        </w:rPr>
-        <w:t xml:space="preserve"> </w:t>
-      </w:r>
-      <w:r>
-        <w:rPr>
-          <w:bCs/>
-        </w:rPr>
-        <w:t>Закрытие дескрипторов записи и потоковое чтение (</w:t>
+        </w:rPr>
+        <w:t xml:space="preserve">Листинг 3 </w:t>
+      </w:r>
+      <w:r>
+        <w:t>-</w:t>
+      </w:r>
+      <w:r>
+        <w:t xml:space="preserve"> Синхронизация и освобождение дескрипторов ядра (</w:t>
       </w:r>
       <w:proofErr w:type="spellStart"/>
       <w:r>
-        <w:rPr>
-          <w:bCs/>
-        </w:rPr>
         <w:t>parent.c</w:t>
       </w:r>
       <w:proofErr w:type="spellEnd"/>
       <w:r>
-        <w:rPr>
-          <w:bCs/>
-        </w:rPr>
         <w:t>)</w:t>
       </w:r>
     </w:p>
@@ -2583,6 +2729,9 @@
       <w:pPr>
         <w:pStyle w:val="ad"/>
         <w:rPr>
+          <w:rFonts w:ascii="Times New Roman" w:eastAsia="Times New Roman" w:hAnsi="Times New Roman" w:cs="Times New Roman"/>
+          <w:sz w:val="24"/>
+          <w:szCs w:val="24"/>
           <w:lang w:val="en-US"/>
         </w:rPr>
       </w:pPr>
@@ -2590,13 +2739,19 @@
       <w:proofErr w:type="gramStart"/>
       <w:r>
         <w:rPr>
+          <w:rFonts w:ascii="Times New Roman" w:eastAsia="Times New Roman" w:hAnsi="Times New Roman" w:cs="Times New Roman"/>
+          <w:sz w:val="24"/>
+          <w:szCs w:val="24"/>
           <w:lang w:val="en-US"/>
         </w:rPr>
-        <w:t>CloseHandle</w:t>
+        <w:t>WaitForSingleObject</w:t>
       </w:r>
       <w:proofErr w:type="spellEnd"/>
       <w:r>
         <w:rPr>
+          <w:rFonts w:ascii="Times New Roman" w:eastAsia="Times New Roman" w:hAnsi="Times New Roman" w:cs="Times New Roman"/>
+          <w:sz w:val="24"/>
+          <w:szCs w:val="24"/>
           <w:lang w:val="en-US"/>
         </w:rPr>
         <w:t>(</w:t>
@@ -2605,58 +2760,31 @@
       <w:proofErr w:type="gramEnd"/>
       <w:r>
         <w:rPr>
+          <w:rFonts w:ascii="Times New Roman" w:eastAsia="Times New Roman" w:hAnsi="Times New Roman" w:cs="Times New Roman"/>
+          <w:sz w:val="24"/>
+          <w:szCs w:val="24"/>
           <w:lang w:val="en-US"/>
         </w:rPr>
-        <w:t>InputFile</w:t>
+        <w:t>pi.hProcess</w:t>
       </w:r>
       <w:proofErr w:type="spellEnd"/>
       <w:r>
         <w:rPr>
+          <w:rFonts w:ascii="Times New Roman" w:eastAsia="Times New Roman" w:hAnsi="Times New Roman" w:cs="Times New Roman"/>
+          <w:sz w:val="24"/>
+          <w:szCs w:val="24"/>
           <w:lang w:val="en-US"/>
         </w:rPr>
-        <w:t xml:space="preserve">); </w:t>
+        <w:t>, INFINITE);</w:t>
       </w:r>
     </w:p>
     <w:p>
       <w:pPr>
         <w:pStyle w:val="ad"/>
         <w:rPr>
-          <w:lang w:val="en-US"/>
-        </w:rPr>
-      </w:pPr>
-      <w:proofErr w:type="spellStart"/>
-      <w:r>
-        <w:rPr>
-          <w:lang w:val="en-US"/>
-        </w:rPr>
-        <w:t>CloseHandle</w:t>
-      </w:r>
-      <w:proofErr w:type="spellEnd"/>
-      <w:r>
-        <w:rPr>
-          <w:lang w:val="en-US"/>
-        </w:rPr>
-        <w:t>(</w:t>
-      </w:r>
-      <w:proofErr w:type="spellStart"/>
-      <w:r>
-        <w:rPr>
-          <w:lang w:val="en-US"/>
-        </w:rPr>
-        <w:t>pipeWrite</w:t>
-      </w:r>
-      <w:proofErr w:type="spellEnd"/>
-      <w:r>
-        <w:rPr>
-          <w:lang w:val="en-US"/>
-        </w:rPr>
-        <w:t>);</w:t>
-      </w:r>
-    </w:p>
-    <w:p>
-      <w:pPr>
-        <w:pStyle w:val="ad"/>
-        <w:rPr>
+          <w:rFonts w:ascii="Times New Roman" w:eastAsia="Times New Roman" w:hAnsi="Times New Roman" w:cs="Times New Roman"/>
+          <w:sz w:val="24"/>
+          <w:szCs w:val="24"/>
           <w:lang w:val="en-US"/>
         </w:rPr>
       </w:pPr>
@@ -2665,48 +2793,78 @@
       <w:pPr>
         <w:pStyle w:val="ad"/>
         <w:rPr>
+          <w:rFonts w:ascii="Times New Roman" w:eastAsia="Times New Roman" w:hAnsi="Times New Roman" w:cs="Times New Roman"/>
+          <w:sz w:val="24"/>
+          <w:szCs w:val="24"/>
           <w:lang w:val="en-US"/>
         </w:rPr>
       </w:pPr>
+      <w:r>
+        <w:rPr>
+          <w:rFonts w:ascii="Times New Roman" w:eastAsia="Times New Roman" w:hAnsi="Times New Roman" w:cs="Times New Roman"/>
+          <w:sz w:val="24"/>
+          <w:szCs w:val="24"/>
+          <w:lang w:val="en-US"/>
+        </w:rPr>
+        <w:t xml:space="preserve">DWORD </w:t>
+      </w:r>
       <w:proofErr w:type="spellStart"/>
       <w:r>
         <w:rPr>
+          <w:rFonts w:ascii="Times New Roman" w:eastAsia="Times New Roman" w:hAnsi="Times New Roman" w:cs="Times New Roman"/>
+          <w:sz w:val="24"/>
+          <w:szCs w:val="24"/>
           <w:lang w:val="en-US"/>
         </w:rPr>
-        <w:t>printf</w:t>
+        <w:t>exitCode</w:t>
       </w:r>
       <w:proofErr w:type="spellEnd"/>
       <w:r>
         <w:rPr>
+          <w:rFonts w:ascii="Times New Roman" w:eastAsia="Times New Roman" w:hAnsi="Times New Roman" w:cs="Times New Roman"/>
+          <w:sz w:val="24"/>
+          <w:szCs w:val="24"/>
           <w:lang w:val="en-US"/>
         </w:rPr>
-        <w:t>("Results:\n");</w:t>
+        <w:t xml:space="preserve"> = 0;</w:t>
       </w:r>
     </w:p>
     <w:p>
       <w:pPr>
         <w:pStyle w:val="ad"/>
         <w:rPr>
+          <w:rFonts w:ascii="Times New Roman" w:eastAsia="Times New Roman" w:hAnsi="Times New Roman" w:cs="Times New Roman"/>
+          <w:sz w:val="24"/>
+          <w:szCs w:val="24"/>
           <w:lang w:val="en-US"/>
         </w:rPr>
       </w:pPr>
       <w:r>
         <w:rPr>
+          <w:rFonts w:ascii="Times New Roman" w:eastAsia="Times New Roman" w:hAnsi="Times New Roman" w:cs="Times New Roman"/>
+          <w:sz w:val="24"/>
+          <w:szCs w:val="24"/>
           <w:lang w:val="en-US"/>
         </w:rPr>
-        <w:t>while (</w:t>
+        <w:t>if (</w:t>
       </w:r>
       <w:proofErr w:type="spellStart"/>
       <w:proofErr w:type="gramStart"/>
       <w:r>
         <w:rPr>
+          <w:rFonts w:ascii="Times New Roman" w:eastAsia="Times New Roman" w:hAnsi="Times New Roman" w:cs="Times New Roman"/>
+          <w:sz w:val="24"/>
+          <w:szCs w:val="24"/>
           <w:lang w:val="en-US"/>
         </w:rPr>
-        <w:t>ReadFile</w:t>
+        <w:t>GetExitCodeProcess</w:t>
       </w:r>
       <w:proofErr w:type="spellEnd"/>
       <w:r>
         <w:rPr>
+          <w:rFonts w:ascii="Times New Roman" w:eastAsia="Times New Roman" w:hAnsi="Times New Roman" w:cs="Times New Roman"/>
+          <w:sz w:val="24"/>
+          <w:szCs w:val="24"/>
           <w:lang w:val="en-US"/>
         </w:rPr>
         <w:t>(</w:t>
@@ -2715,55 +2873,59 @@
       <w:proofErr w:type="gramEnd"/>
       <w:r>
         <w:rPr>
+          <w:rFonts w:ascii="Times New Roman" w:eastAsia="Times New Roman" w:hAnsi="Times New Roman" w:cs="Times New Roman"/>
+          <w:sz w:val="24"/>
+          <w:szCs w:val="24"/>
           <w:lang w:val="en-US"/>
         </w:rPr>
-        <w:t>pipeRead</w:t>
+        <w:t>pi.hProcess</w:t>
       </w:r>
       <w:proofErr w:type="spellEnd"/>
       <w:r>
         <w:rPr>
+          <w:rFonts w:ascii="Times New Roman" w:eastAsia="Times New Roman" w:hAnsi="Times New Roman" w:cs="Times New Roman"/>
+          <w:sz w:val="24"/>
+          <w:szCs w:val="24"/>
           <w:lang w:val="en-US"/>
         </w:rPr>
-        <w:t xml:space="preserve">, buffer, </w:t>
+        <w:t>, &amp;</w:t>
       </w:r>
       <w:proofErr w:type="spellStart"/>
       <w:r>
         <w:rPr>
+          <w:rFonts w:ascii="Times New Roman" w:eastAsia="Times New Roman" w:hAnsi="Times New Roman" w:cs="Times New Roman"/>
+          <w:sz w:val="24"/>
+          <w:szCs w:val="24"/>
           <w:lang w:val="en-US"/>
         </w:rPr>
-        <w:t>sizeof</w:t>
+        <w:t>exitCode</w:t>
       </w:r>
       <w:proofErr w:type="spellEnd"/>
       <w:r>
         <w:rPr>
+          <w:rFonts w:ascii="Times New Roman" w:eastAsia="Times New Roman" w:hAnsi="Times New Roman" w:cs="Times New Roman"/>
+          <w:sz w:val="24"/>
+          <w:szCs w:val="24"/>
           <w:lang w:val="en-US"/>
         </w:rPr>
-        <w:t>(buffer) - 1, &amp;</w:t>
-      </w:r>
-      <w:proofErr w:type="spellStart"/>
-      <w:r>
-        <w:rPr>
-          <w:lang w:val="en-US"/>
-        </w:rPr>
-        <w:t>bytesRead</w:t>
-      </w:r>
-      <w:proofErr w:type="spellEnd"/>
-      <w:r>
-        <w:rPr>
-          <w:lang w:val="en-US"/>
-        </w:rPr>
-        <w:t>, NULL)) {</w:t>
+        <w:t>)) {</w:t>
       </w:r>
     </w:p>
     <w:p>
       <w:pPr>
         <w:pStyle w:val="ad"/>
         <w:rPr>
+          <w:rFonts w:ascii="Times New Roman" w:eastAsia="Times New Roman" w:hAnsi="Times New Roman" w:cs="Times New Roman"/>
+          <w:sz w:val="24"/>
+          <w:szCs w:val="24"/>
           <w:lang w:val="en-US"/>
         </w:rPr>
       </w:pPr>
       <w:r>
         <w:rPr>
+          <w:rFonts w:ascii="Times New Roman" w:eastAsia="Times New Roman" w:hAnsi="Times New Roman" w:cs="Times New Roman"/>
+          <w:sz w:val="24"/>
+          <w:szCs w:val="24"/>
           <w:lang w:val="en-US"/>
         </w:rPr>
         <w:t xml:space="preserve">    if (</w:t>
@@ -2771,91 +2933,130 @@
       <w:proofErr w:type="spellStart"/>
       <w:r>
         <w:rPr>
+          <w:rFonts w:ascii="Times New Roman" w:eastAsia="Times New Roman" w:hAnsi="Times New Roman" w:cs="Times New Roman"/>
+          <w:sz w:val="24"/>
+          <w:szCs w:val="24"/>
           <w:lang w:val="en-US"/>
         </w:rPr>
-        <w:t>bytesRead</w:t>
+        <w:t>exitCode</w:t>
       </w:r>
       <w:proofErr w:type="spellEnd"/>
       <w:r>
         <w:rPr>
+          <w:rFonts w:ascii="Times New Roman" w:eastAsia="Times New Roman" w:hAnsi="Times New Roman" w:cs="Times New Roman"/>
+          <w:sz w:val="24"/>
+          <w:szCs w:val="24"/>
           <w:lang w:val="en-US"/>
         </w:rPr>
-        <w:t xml:space="preserve"> == 0) break;</w:t>
+        <w:t xml:space="preserve"> == 2) {</w:t>
       </w:r>
     </w:p>
     <w:p>
       <w:pPr>
         <w:pStyle w:val="ad"/>
         <w:rPr>
+          <w:rFonts w:ascii="Times New Roman" w:eastAsia="Times New Roman" w:hAnsi="Times New Roman" w:cs="Times New Roman"/>
+          <w:sz w:val="24"/>
+          <w:szCs w:val="24"/>
           <w:lang w:val="en-US"/>
         </w:rPr>
       </w:pPr>
       <w:r>
         <w:rPr>
+          <w:rFonts w:ascii="Times New Roman" w:eastAsia="Times New Roman" w:hAnsi="Times New Roman" w:cs="Times New Roman"/>
+          <w:sz w:val="24"/>
+          <w:szCs w:val="24"/>
           <w:lang w:val="en-US"/>
         </w:rPr>
-        <w:t xml:space="preserve">    buffer[</w:t>
+        <w:t xml:space="preserve">        </w:t>
       </w:r>
       <w:proofErr w:type="spellStart"/>
-      <w:r>
-        <w:rPr>
+      <w:proofErr w:type="gramStart"/>
+      <w:r>
+        <w:rPr>
+          <w:rFonts w:ascii="Times New Roman" w:eastAsia="Times New Roman" w:hAnsi="Times New Roman" w:cs="Times New Roman"/>
+          <w:sz w:val="24"/>
+          <w:szCs w:val="24"/>
           <w:lang w:val="en-US"/>
         </w:rPr>
-        <w:t>bytesRead</w:t>
+        <w:t>printf</w:t>
       </w:r>
       <w:proofErr w:type="spellEnd"/>
       <w:r>
         <w:rPr>
+          <w:rFonts w:ascii="Times New Roman" w:eastAsia="Times New Roman" w:hAnsi="Times New Roman" w:cs="Times New Roman"/>
+          <w:sz w:val="24"/>
+          <w:szCs w:val="24"/>
           <w:lang w:val="en-US"/>
         </w:rPr>
-        <w:t>] = '\0';</w:t>
+        <w:t>(</w:t>
+      </w:r>
+      <w:proofErr w:type="gramEnd"/>
+      <w:r>
+        <w:rPr>
+          <w:rFonts w:ascii="Times New Roman" w:eastAsia="Times New Roman" w:hAnsi="Times New Roman" w:cs="Times New Roman"/>
+          <w:sz w:val="24"/>
+          <w:szCs w:val="24"/>
+          <w:lang w:val="en-US"/>
+        </w:rPr>
+        <w:t>"\</w:t>
+      </w:r>
+      <w:proofErr w:type="spellStart"/>
+      <w:r>
+        <w:rPr>
+          <w:rFonts w:ascii="Times New Roman" w:eastAsia="Times New Roman" w:hAnsi="Times New Roman" w:cs="Times New Roman"/>
+          <w:sz w:val="24"/>
+          <w:szCs w:val="24"/>
+          <w:lang w:val="en-US"/>
+        </w:rPr>
+        <w:t>nChild</w:t>
+      </w:r>
+      <w:proofErr w:type="spellEnd"/>
+      <w:r>
+        <w:rPr>
+          <w:rFonts w:ascii="Times New Roman" w:eastAsia="Times New Roman" w:hAnsi="Times New Roman" w:cs="Times New Roman"/>
+          <w:sz w:val="24"/>
+          <w:szCs w:val="24"/>
+          <w:lang w:val="en-US"/>
+        </w:rPr>
+        <w:t xml:space="preserve"> process reported\n");</w:t>
       </w:r>
     </w:p>
     <w:p>
       <w:pPr>
         <w:pStyle w:val="ad"/>
         <w:rPr>
+          <w:rFonts w:ascii="Times New Roman" w:eastAsia="Times New Roman" w:hAnsi="Times New Roman" w:cs="Times New Roman"/>
+          <w:sz w:val="24"/>
+          <w:szCs w:val="24"/>
           <w:lang w:val="en-US"/>
         </w:rPr>
       </w:pPr>
       <w:r>
         <w:rPr>
+          <w:rFonts w:ascii="Times New Roman" w:eastAsia="Times New Roman" w:hAnsi="Times New Roman" w:cs="Times New Roman"/>
+          <w:sz w:val="24"/>
+          <w:szCs w:val="24"/>
           <w:lang w:val="en-US"/>
         </w:rPr>
-        <w:t xml:space="preserve">    </w:t>
-      </w:r>
-      <w:proofErr w:type="spellStart"/>
-      <w:proofErr w:type="gramStart"/>
-      <w:r>
-        <w:rPr>
-          <w:lang w:val="en-US"/>
-        </w:rPr>
-        <w:t>printf</w:t>
-      </w:r>
-      <w:proofErr w:type="spellEnd"/>
-      <w:r>
-        <w:rPr>
-          <w:lang w:val="en-US"/>
-        </w:rPr>
-        <w:t>(</w:t>
-      </w:r>
-      <w:proofErr w:type="gramEnd"/>
-      <w:r>
-        <w:rPr>
-          <w:lang w:val="en-US"/>
-        </w:rPr>
-        <w:t>"%s", buffer);</w:t>
+        <w:t xml:space="preserve">    }</w:t>
       </w:r>
     </w:p>
     <w:p>
       <w:pPr>
         <w:pStyle w:val="ad"/>
         <w:rPr>
+          <w:rFonts w:ascii="Times New Roman" w:eastAsia="Times New Roman" w:hAnsi="Times New Roman" w:cs="Times New Roman"/>
+          <w:sz w:val="24"/>
+          <w:szCs w:val="24"/>
           <w:lang w:val="en-US"/>
         </w:rPr>
       </w:pPr>
       <w:r>
         <w:rPr>
+          <w:rFonts w:ascii="Times New Roman" w:eastAsia="Times New Roman" w:hAnsi="Times New Roman" w:cs="Times New Roman"/>
+          <w:sz w:val="24"/>
+          <w:szCs w:val="24"/>
           <w:lang w:val="en-US"/>
         </w:rPr>
         <w:t>}</w:t>
@@ -2863,567 +3064,176 @@
     </w:p>
     <w:p>
       <w:pPr>
-        <w:spacing w:after="120"/>
-        <w:rPr>
+        <w:pStyle w:val="ad"/>
+        <w:rPr>
+          <w:rFonts w:ascii="Times New Roman" w:eastAsia="Times New Roman" w:hAnsi="Times New Roman" w:cs="Times New Roman"/>
+          <w:sz w:val="24"/>
+          <w:szCs w:val="24"/>
           <w:lang w:val="en-US"/>
         </w:rPr>
+      </w:pPr>
+      <w:proofErr w:type="spellStart"/>
+      <w:r>
+        <w:rPr>
+          <w:rFonts w:ascii="Times New Roman" w:eastAsia="Times New Roman" w:hAnsi="Times New Roman" w:cs="Times New Roman"/>
+          <w:sz w:val="24"/>
+          <w:szCs w:val="24"/>
+          <w:lang w:val="en-US"/>
+        </w:rPr>
+        <w:t>CloseHandle</w:t>
+      </w:r>
+      <w:proofErr w:type="spellEnd"/>
+      <w:r>
+        <w:rPr>
+          <w:rFonts w:ascii="Times New Roman" w:eastAsia="Times New Roman" w:hAnsi="Times New Roman" w:cs="Times New Roman"/>
+          <w:sz w:val="24"/>
+          <w:szCs w:val="24"/>
+          <w:lang w:val="en-US"/>
+        </w:rPr>
+        <w:t>(</w:t>
+      </w:r>
+      <w:proofErr w:type="spellStart"/>
+      <w:proofErr w:type="gramStart"/>
+      <w:r>
+        <w:rPr>
+          <w:rFonts w:ascii="Times New Roman" w:eastAsia="Times New Roman" w:hAnsi="Times New Roman" w:cs="Times New Roman"/>
+          <w:sz w:val="24"/>
+          <w:szCs w:val="24"/>
+          <w:lang w:val="en-US"/>
+        </w:rPr>
+        <w:t>pi.hProcess</w:t>
+      </w:r>
+      <w:proofErr w:type="spellEnd"/>
+      <w:proofErr w:type="gramEnd"/>
+      <w:r>
+        <w:rPr>
+          <w:rFonts w:ascii="Times New Roman" w:eastAsia="Times New Roman" w:hAnsi="Times New Roman" w:cs="Times New Roman"/>
+          <w:sz w:val="24"/>
+          <w:szCs w:val="24"/>
+          <w:lang w:val="en-US"/>
+        </w:rPr>
+        <w:t>);</w:t>
+      </w:r>
+    </w:p>
+    <w:p>
+      <w:pPr>
+        <w:pStyle w:val="ad"/>
+        <w:rPr>
+          <w:rFonts w:ascii="Times New Roman" w:eastAsia="Times New Roman" w:hAnsi="Times New Roman" w:cs="Times New Roman"/>
+          <w:sz w:val="24"/>
+          <w:szCs w:val="24"/>
+          <w:lang w:val="en-US"/>
+        </w:rPr>
+      </w:pPr>
+      <w:proofErr w:type="spellStart"/>
+      <w:r>
+        <w:rPr>
+          <w:rFonts w:ascii="Times New Roman" w:eastAsia="Times New Roman" w:hAnsi="Times New Roman" w:cs="Times New Roman"/>
+          <w:sz w:val="24"/>
+          <w:szCs w:val="24"/>
+          <w:lang w:val="en-US"/>
+        </w:rPr>
+        <w:t>CloseHandle</w:t>
+      </w:r>
+      <w:proofErr w:type="spellEnd"/>
+      <w:r>
+        <w:rPr>
+          <w:rFonts w:ascii="Times New Roman" w:eastAsia="Times New Roman" w:hAnsi="Times New Roman" w:cs="Times New Roman"/>
+          <w:sz w:val="24"/>
+          <w:szCs w:val="24"/>
+          <w:lang w:val="en-US"/>
+        </w:rPr>
+        <w:t>(</w:t>
+      </w:r>
+      <w:proofErr w:type="spellStart"/>
+      <w:proofErr w:type="gramStart"/>
+      <w:r>
+        <w:rPr>
+          <w:rFonts w:ascii="Times New Roman" w:eastAsia="Times New Roman" w:hAnsi="Times New Roman" w:cs="Times New Roman"/>
+          <w:sz w:val="24"/>
+          <w:szCs w:val="24"/>
+          <w:lang w:val="en-US"/>
+        </w:rPr>
+        <w:t>pi.hThread</w:t>
+      </w:r>
+      <w:proofErr w:type="spellEnd"/>
+      <w:proofErr w:type="gramEnd"/>
+      <w:r>
+        <w:rPr>
+          <w:rFonts w:ascii="Times New Roman" w:eastAsia="Times New Roman" w:hAnsi="Times New Roman" w:cs="Times New Roman"/>
+          <w:sz w:val="24"/>
+          <w:szCs w:val="24"/>
+          <w:lang w:val="en-US"/>
+        </w:rPr>
+        <w:t>);</w:t>
+      </w:r>
+    </w:p>
+    <w:p>
+      <w:pPr>
+        <w:pStyle w:val="ad"/>
+        <w:rPr>
+          <w:rFonts w:ascii="Times New Roman" w:eastAsia="Times New Roman" w:hAnsi="Times New Roman" w:cs="Times New Roman"/>
+          <w:sz w:val="24"/>
+          <w:szCs w:val="24"/>
+        </w:rPr>
+      </w:pPr>
+      <w:proofErr w:type="spellStart"/>
+      <w:r>
+        <w:rPr>
+          <w:rFonts w:ascii="Times New Roman" w:eastAsia="Times New Roman" w:hAnsi="Times New Roman" w:cs="Times New Roman"/>
+          <w:sz w:val="24"/>
+          <w:szCs w:val="24"/>
+          <w:lang w:val="en-US"/>
+        </w:rPr>
+        <w:t>CloseHandle</w:t>
+      </w:r>
+      <w:proofErr w:type="spellEnd"/>
+      <w:r>
+        <w:rPr>
+          <w:rFonts w:ascii="Times New Roman" w:eastAsia="Times New Roman" w:hAnsi="Times New Roman" w:cs="Times New Roman"/>
+          <w:sz w:val="24"/>
+          <w:szCs w:val="24"/>
+        </w:rPr>
+        <w:t>(</w:t>
+      </w:r>
+      <w:proofErr w:type="spellStart"/>
+      <w:r>
+        <w:rPr>
+          <w:rFonts w:ascii="Times New Roman" w:eastAsia="Times New Roman" w:hAnsi="Times New Roman" w:cs="Times New Roman"/>
+          <w:sz w:val="24"/>
+          <w:szCs w:val="24"/>
+          <w:lang w:val="en-US"/>
+        </w:rPr>
+        <w:t>pipeRead</w:t>
+      </w:r>
+      <w:proofErr w:type="spellEnd"/>
+      <w:r>
+        <w:rPr>
+          <w:rFonts w:ascii="Times New Roman" w:eastAsia="Times New Roman" w:hAnsi="Times New Roman" w:cs="Times New Roman"/>
+          <w:sz w:val="24"/>
+          <w:szCs w:val="24"/>
+        </w:rPr>
+        <w:t>);</w:t>
+      </w:r>
+    </w:p>
+    <w:p>
+      <w:pPr>
+        <w:pStyle w:val="ad"/>
       </w:pPr>
     </w:p>
     <w:p>
       <w:pPr>
         <w:spacing w:after="120"/>
       </w:pPr>
-      <w:r>
-        <w:rPr>
-          <w:b/>
-        </w:rPr>
-        <w:t>Листинг 3</w:t>
-      </w:r>
-      <w:r>
-        <w:rPr>
-          <w:b/>
-        </w:rPr>
-        <w:t xml:space="preserve"> </w:t>
-      </w:r>
-      <w:r>
-        <w:t>-</w:t>
-      </w:r>
-      <w:r>
-        <w:t xml:space="preserve"> Синхронизация и освобождение дескрипторов ядра (</w:t>
-      </w:r>
-      <w:proofErr w:type="spellStart"/>
-      <w:r>
-        <w:t>parent.c</w:t>
-      </w:r>
-      <w:proofErr w:type="spellEnd"/>
-      <w:r>
-        <w:t>)</w:t>
-      </w:r>
-    </w:p>
-    <w:p>
-      <w:pPr>
-        <w:pStyle w:val="ad"/>
-        <w:rPr>
-          <w:rFonts w:ascii="Times New Roman" w:eastAsia="Times New Roman" w:hAnsi="Times New Roman" w:cs="Times New Roman"/>
-          <w:sz w:val="24"/>
-          <w:szCs w:val="24"/>
-          <w:lang w:val="en-US"/>
-        </w:rPr>
-      </w:pPr>
-      <w:proofErr w:type="spellStart"/>
-      <w:proofErr w:type="gramStart"/>
-      <w:r>
-        <w:rPr>
-          <w:rFonts w:ascii="Times New Roman" w:eastAsia="Times New Roman" w:hAnsi="Times New Roman" w:cs="Times New Roman"/>
-          <w:sz w:val="24"/>
-          <w:szCs w:val="24"/>
-          <w:lang w:val="en-US"/>
-        </w:rPr>
-        <w:t>WaitForSingleObject</w:t>
-      </w:r>
-      <w:proofErr w:type="spellEnd"/>
-      <w:r>
-        <w:rPr>
-          <w:rFonts w:ascii="Times New Roman" w:eastAsia="Times New Roman" w:hAnsi="Times New Roman" w:cs="Times New Roman"/>
-          <w:sz w:val="24"/>
-          <w:szCs w:val="24"/>
-          <w:lang w:val="en-US"/>
-        </w:rPr>
-        <w:t>(</w:t>
-      </w:r>
-      <w:proofErr w:type="spellStart"/>
-      <w:proofErr w:type="gramEnd"/>
-      <w:r>
-        <w:rPr>
-          <w:rFonts w:ascii="Times New Roman" w:eastAsia="Times New Roman" w:hAnsi="Times New Roman" w:cs="Times New Roman"/>
-          <w:sz w:val="24"/>
-          <w:szCs w:val="24"/>
-          <w:lang w:val="en-US"/>
-        </w:rPr>
-        <w:t>pi.hProcess</w:t>
-      </w:r>
-      <w:proofErr w:type="spellEnd"/>
-      <w:r>
-        <w:rPr>
-          <w:rFonts w:ascii="Times New Roman" w:eastAsia="Times New Roman" w:hAnsi="Times New Roman" w:cs="Times New Roman"/>
-          <w:sz w:val="24"/>
-          <w:szCs w:val="24"/>
-          <w:lang w:val="en-US"/>
-        </w:rPr>
-        <w:t>, INFINITE);</w:t>
-      </w:r>
-    </w:p>
-    <w:p>
-      <w:pPr>
-        <w:pStyle w:val="ad"/>
-        <w:rPr>
-          <w:rFonts w:ascii="Times New Roman" w:eastAsia="Times New Roman" w:hAnsi="Times New Roman" w:cs="Times New Roman"/>
-          <w:sz w:val="24"/>
-          <w:szCs w:val="24"/>
-          <w:lang w:val="en-US"/>
-        </w:rPr>
-      </w:pPr>
-    </w:p>
-    <w:p>
-      <w:pPr>
-        <w:pStyle w:val="ad"/>
-        <w:rPr>
-          <w:rFonts w:ascii="Times New Roman" w:eastAsia="Times New Roman" w:hAnsi="Times New Roman" w:cs="Times New Roman"/>
-          <w:sz w:val="24"/>
-          <w:szCs w:val="24"/>
-          <w:lang w:val="en-US"/>
-        </w:rPr>
-      </w:pPr>
-      <w:r>
-        <w:rPr>
-          <w:rFonts w:ascii="Times New Roman" w:eastAsia="Times New Roman" w:hAnsi="Times New Roman" w:cs="Times New Roman"/>
-          <w:sz w:val="24"/>
-          <w:szCs w:val="24"/>
-          <w:lang w:val="en-US"/>
-        </w:rPr>
-        <w:t xml:space="preserve">DWORD </w:t>
-      </w:r>
-      <w:proofErr w:type="spellStart"/>
-      <w:r>
-        <w:rPr>
-          <w:rFonts w:ascii="Times New Roman" w:eastAsia="Times New Roman" w:hAnsi="Times New Roman" w:cs="Times New Roman"/>
-          <w:sz w:val="24"/>
-          <w:szCs w:val="24"/>
-          <w:lang w:val="en-US"/>
-        </w:rPr>
-        <w:t>exitCode</w:t>
-      </w:r>
-      <w:proofErr w:type="spellEnd"/>
-      <w:r>
-        <w:rPr>
-          <w:rFonts w:ascii="Times New Roman" w:eastAsia="Times New Roman" w:hAnsi="Times New Roman" w:cs="Times New Roman"/>
-          <w:sz w:val="24"/>
-          <w:szCs w:val="24"/>
-          <w:lang w:val="en-US"/>
-        </w:rPr>
-        <w:t xml:space="preserve"> = 0;</w:t>
-      </w:r>
-    </w:p>
-    <w:p>
-      <w:pPr>
-        <w:pStyle w:val="ad"/>
-        <w:rPr>
-          <w:rFonts w:ascii="Times New Roman" w:eastAsia="Times New Roman" w:hAnsi="Times New Roman" w:cs="Times New Roman"/>
-          <w:sz w:val="24"/>
-          <w:szCs w:val="24"/>
-          <w:lang w:val="en-US"/>
-        </w:rPr>
-      </w:pPr>
-      <w:r>
-        <w:rPr>
-          <w:rFonts w:ascii="Times New Roman" w:eastAsia="Times New Roman" w:hAnsi="Times New Roman" w:cs="Times New Roman"/>
-          <w:sz w:val="24"/>
-          <w:szCs w:val="24"/>
-          <w:lang w:val="en-US"/>
-        </w:rPr>
-        <w:t>if (</w:t>
-      </w:r>
-      <w:proofErr w:type="spellStart"/>
-      <w:proofErr w:type="gramStart"/>
-      <w:r>
-        <w:rPr>
-          <w:rFonts w:ascii="Times New Roman" w:eastAsia="Times New Roman" w:hAnsi="Times New Roman" w:cs="Times New Roman"/>
-          <w:sz w:val="24"/>
-          <w:szCs w:val="24"/>
-          <w:lang w:val="en-US"/>
-        </w:rPr>
-        <w:t>GetExitCodeProcess</w:t>
-      </w:r>
-      <w:proofErr w:type="spellEnd"/>
-      <w:r>
-        <w:rPr>
-          <w:rFonts w:ascii="Times New Roman" w:eastAsia="Times New Roman" w:hAnsi="Times New Roman" w:cs="Times New Roman"/>
-          <w:sz w:val="24"/>
-          <w:szCs w:val="24"/>
-          <w:lang w:val="en-US"/>
-        </w:rPr>
-        <w:t>(</w:t>
-      </w:r>
-      <w:proofErr w:type="spellStart"/>
-      <w:proofErr w:type="gramEnd"/>
-      <w:r>
-        <w:rPr>
-          <w:rFonts w:ascii="Times New Roman" w:eastAsia="Times New Roman" w:hAnsi="Times New Roman" w:cs="Times New Roman"/>
-          <w:sz w:val="24"/>
-          <w:szCs w:val="24"/>
-          <w:lang w:val="en-US"/>
-        </w:rPr>
-        <w:t>pi.hProcess</w:t>
-      </w:r>
-      <w:proofErr w:type="spellEnd"/>
-      <w:r>
-        <w:rPr>
-          <w:rFonts w:ascii="Times New Roman" w:eastAsia="Times New Roman" w:hAnsi="Times New Roman" w:cs="Times New Roman"/>
-          <w:sz w:val="24"/>
-          <w:szCs w:val="24"/>
-          <w:lang w:val="en-US"/>
-        </w:rPr>
-        <w:t>, &amp;</w:t>
-      </w:r>
-      <w:proofErr w:type="spellStart"/>
-      <w:r>
-        <w:rPr>
-          <w:rFonts w:ascii="Times New Roman" w:eastAsia="Times New Roman" w:hAnsi="Times New Roman" w:cs="Times New Roman"/>
-          <w:sz w:val="24"/>
-          <w:szCs w:val="24"/>
-          <w:lang w:val="en-US"/>
-        </w:rPr>
-        <w:t>exitCode</w:t>
-      </w:r>
-      <w:proofErr w:type="spellEnd"/>
-      <w:r>
-        <w:rPr>
-          <w:rFonts w:ascii="Times New Roman" w:eastAsia="Times New Roman" w:hAnsi="Times New Roman" w:cs="Times New Roman"/>
-          <w:sz w:val="24"/>
-          <w:szCs w:val="24"/>
-          <w:lang w:val="en-US"/>
-        </w:rPr>
-        <w:t>)) {</w:t>
-      </w:r>
-    </w:p>
-    <w:p>
-      <w:pPr>
-        <w:pStyle w:val="ad"/>
-        <w:rPr>
-          <w:rFonts w:ascii="Times New Roman" w:eastAsia="Times New Roman" w:hAnsi="Times New Roman" w:cs="Times New Roman"/>
-          <w:sz w:val="24"/>
-          <w:szCs w:val="24"/>
-          <w:lang w:val="en-US"/>
-        </w:rPr>
-      </w:pPr>
-      <w:r>
-        <w:rPr>
-          <w:rFonts w:ascii="Times New Roman" w:eastAsia="Times New Roman" w:hAnsi="Times New Roman" w:cs="Times New Roman"/>
-          <w:sz w:val="24"/>
-          <w:szCs w:val="24"/>
-          <w:lang w:val="en-US"/>
-        </w:rPr>
-        <w:t xml:space="preserve">    if (</w:t>
-      </w:r>
-      <w:proofErr w:type="spellStart"/>
-      <w:r>
-        <w:rPr>
-          <w:rFonts w:ascii="Times New Roman" w:eastAsia="Times New Roman" w:hAnsi="Times New Roman" w:cs="Times New Roman"/>
-          <w:sz w:val="24"/>
-          <w:szCs w:val="24"/>
-          <w:lang w:val="en-US"/>
-        </w:rPr>
-        <w:t>exitCode</w:t>
-      </w:r>
-      <w:proofErr w:type="spellEnd"/>
-      <w:r>
-        <w:rPr>
-          <w:rFonts w:ascii="Times New Roman" w:eastAsia="Times New Roman" w:hAnsi="Times New Roman" w:cs="Times New Roman"/>
-          <w:sz w:val="24"/>
-          <w:szCs w:val="24"/>
-          <w:lang w:val="en-US"/>
-        </w:rPr>
-        <w:t xml:space="preserve"> == 2) {</w:t>
-      </w:r>
-    </w:p>
-    <w:p>
-      <w:pPr>
-        <w:pStyle w:val="ad"/>
-        <w:rPr>
-          <w:rFonts w:ascii="Times New Roman" w:eastAsia="Times New Roman" w:hAnsi="Times New Roman" w:cs="Times New Roman"/>
-          <w:sz w:val="24"/>
-          <w:szCs w:val="24"/>
-          <w:lang w:val="en-US"/>
-        </w:rPr>
-      </w:pPr>
-      <w:r>
-        <w:rPr>
-          <w:rFonts w:ascii="Times New Roman" w:eastAsia="Times New Roman" w:hAnsi="Times New Roman" w:cs="Times New Roman"/>
-          <w:sz w:val="24"/>
-          <w:szCs w:val="24"/>
-          <w:lang w:val="en-US"/>
-        </w:rPr>
-        <w:t xml:space="preserve">        </w:t>
-      </w:r>
-      <w:proofErr w:type="spellStart"/>
-      <w:proofErr w:type="gramStart"/>
-      <w:r>
-        <w:rPr>
-          <w:rFonts w:ascii="Times New Roman" w:eastAsia="Times New Roman" w:hAnsi="Times New Roman" w:cs="Times New Roman"/>
-          <w:sz w:val="24"/>
-          <w:szCs w:val="24"/>
-          <w:lang w:val="en-US"/>
-        </w:rPr>
-        <w:t>printf</w:t>
-      </w:r>
-      <w:proofErr w:type="spellEnd"/>
-      <w:r>
-        <w:rPr>
-          <w:rFonts w:ascii="Times New Roman" w:eastAsia="Times New Roman" w:hAnsi="Times New Roman" w:cs="Times New Roman"/>
-          <w:sz w:val="24"/>
-          <w:szCs w:val="24"/>
-          <w:lang w:val="en-US"/>
-        </w:rPr>
-        <w:t>(</w:t>
-      </w:r>
-      <w:proofErr w:type="gramEnd"/>
-      <w:r>
-        <w:rPr>
-          <w:rFonts w:ascii="Times New Roman" w:eastAsia="Times New Roman" w:hAnsi="Times New Roman" w:cs="Times New Roman"/>
-          <w:sz w:val="24"/>
-          <w:szCs w:val="24"/>
-          <w:lang w:val="en-US"/>
-        </w:rPr>
-        <w:t>"\</w:t>
-      </w:r>
-      <w:proofErr w:type="spellStart"/>
-      <w:r>
-        <w:rPr>
-          <w:rFonts w:ascii="Times New Roman" w:eastAsia="Times New Roman" w:hAnsi="Times New Roman" w:cs="Times New Roman"/>
-          <w:sz w:val="24"/>
-          <w:szCs w:val="24"/>
-          <w:lang w:val="en-US"/>
-        </w:rPr>
-        <w:t>nChild</w:t>
-      </w:r>
-      <w:proofErr w:type="spellEnd"/>
-      <w:r>
-        <w:rPr>
-          <w:rFonts w:ascii="Times New Roman" w:eastAsia="Times New Roman" w:hAnsi="Times New Roman" w:cs="Times New Roman"/>
-          <w:sz w:val="24"/>
-          <w:szCs w:val="24"/>
-          <w:lang w:val="en-US"/>
-        </w:rPr>
-        <w:t xml:space="preserve"> process reported\n");</w:t>
-      </w:r>
-    </w:p>
-    <w:p>
-      <w:pPr>
-        <w:pStyle w:val="ad"/>
-        <w:rPr>
-          <w:rFonts w:ascii="Times New Roman" w:eastAsia="Times New Roman" w:hAnsi="Times New Roman" w:cs="Times New Roman"/>
-          <w:sz w:val="24"/>
-          <w:szCs w:val="24"/>
-          <w:lang w:val="en-US"/>
-        </w:rPr>
-      </w:pPr>
-      <w:r>
-        <w:rPr>
-          <w:rFonts w:ascii="Times New Roman" w:eastAsia="Times New Roman" w:hAnsi="Times New Roman" w:cs="Times New Roman"/>
-          <w:sz w:val="24"/>
-          <w:szCs w:val="24"/>
-          <w:lang w:val="en-US"/>
-        </w:rPr>
-        <w:t xml:space="preserve">    }</w:t>
-      </w:r>
-    </w:p>
-    <w:p>
-      <w:pPr>
-        <w:pStyle w:val="ad"/>
-        <w:rPr>
-          <w:rFonts w:ascii="Times New Roman" w:eastAsia="Times New Roman" w:hAnsi="Times New Roman" w:cs="Times New Roman"/>
-          <w:sz w:val="24"/>
-          <w:szCs w:val="24"/>
-          <w:lang w:val="en-US"/>
-        </w:rPr>
-      </w:pPr>
-      <w:r>
-        <w:rPr>
-          <w:rFonts w:ascii="Times New Roman" w:eastAsia="Times New Roman" w:hAnsi="Times New Roman" w:cs="Times New Roman"/>
-          <w:sz w:val="24"/>
-          <w:szCs w:val="24"/>
-          <w:lang w:val="en-US"/>
-        </w:rPr>
-        <w:t>}</w:t>
-      </w:r>
-    </w:p>
-    <w:p>
-      <w:pPr>
-        <w:pStyle w:val="ad"/>
-        <w:rPr>
-          <w:rFonts w:ascii="Times New Roman" w:eastAsia="Times New Roman" w:hAnsi="Times New Roman" w:cs="Times New Roman"/>
-          <w:sz w:val="24"/>
-          <w:szCs w:val="24"/>
-          <w:lang w:val="en-US"/>
-        </w:rPr>
-      </w:pPr>
-      <w:proofErr w:type="spellStart"/>
-      <w:r>
-        <w:rPr>
-          <w:rFonts w:ascii="Times New Roman" w:eastAsia="Times New Roman" w:hAnsi="Times New Roman" w:cs="Times New Roman"/>
-          <w:sz w:val="24"/>
-          <w:szCs w:val="24"/>
-          <w:lang w:val="en-US"/>
-        </w:rPr>
-        <w:t>CloseHandle</w:t>
-      </w:r>
-      <w:proofErr w:type="spellEnd"/>
-      <w:r>
-        <w:rPr>
-          <w:rFonts w:ascii="Times New Roman" w:eastAsia="Times New Roman" w:hAnsi="Times New Roman" w:cs="Times New Roman"/>
-          <w:sz w:val="24"/>
-          <w:szCs w:val="24"/>
-          <w:lang w:val="en-US"/>
-        </w:rPr>
-        <w:t>(</w:t>
-      </w:r>
-      <w:proofErr w:type="spellStart"/>
-      <w:proofErr w:type="gramStart"/>
-      <w:r>
-        <w:rPr>
-          <w:rFonts w:ascii="Times New Roman" w:eastAsia="Times New Roman" w:hAnsi="Times New Roman" w:cs="Times New Roman"/>
-          <w:sz w:val="24"/>
-          <w:szCs w:val="24"/>
-          <w:lang w:val="en-US"/>
-        </w:rPr>
-        <w:t>pi.hProcess</w:t>
-      </w:r>
-      <w:proofErr w:type="spellEnd"/>
-      <w:proofErr w:type="gramEnd"/>
-      <w:r>
-        <w:rPr>
-          <w:rFonts w:ascii="Times New Roman" w:eastAsia="Times New Roman" w:hAnsi="Times New Roman" w:cs="Times New Roman"/>
-          <w:sz w:val="24"/>
-          <w:szCs w:val="24"/>
-          <w:lang w:val="en-US"/>
-        </w:rPr>
-        <w:t>);</w:t>
-      </w:r>
-    </w:p>
-    <w:p>
-      <w:pPr>
-        <w:pStyle w:val="ad"/>
-        <w:rPr>
-          <w:rFonts w:ascii="Times New Roman" w:eastAsia="Times New Roman" w:hAnsi="Times New Roman" w:cs="Times New Roman"/>
-          <w:sz w:val="24"/>
-          <w:szCs w:val="24"/>
-          <w:lang w:val="en-US"/>
-        </w:rPr>
-      </w:pPr>
-      <w:proofErr w:type="spellStart"/>
-      <w:r>
-        <w:rPr>
-          <w:rFonts w:ascii="Times New Roman" w:eastAsia="Times New Roman" w:hAnsi="Times New Roman" w:cs="Times New Roman"/>
-          <w:sz w:val="24"/>
-          <w:szCs w:val="24"/>
-          <w:lang w:val="en-US"/>
-        </w:rPr>
-        <w:t>CloseHandle</w:t>
-      </w:r>
-      <w:proofErr w:type="spellEnd"/>
-      <w:r>
-        <w:rPr>
-          <w:rFonts w:ascii="Times New Roman" w:eastAsia="Times New Roman" w:hAnsi="Times New Roman" w:cs="Times New Roman"/>
-          <w:sz w:val="24"/>
-          <w:szCs w:val="24"/>
-          <w:lang w:val="en-US"/>
-        </w:rPr>
-        <w:t>(</w:t>
-      </w:r>
-      <w:proofErr w:type="spellStart"/>
-      <w:proofErr w:type="gramStart"/>
-      <w:r>
-        <w:rPr>
-          <w:rFonts w:ascii="Times New Roman" w:eastAsia="Times New Roman" w:hAnsi="Times New Roman" w:cs="Times New Roman"/>
-          <w:sz w:val="24"/>
-          <w:szCs w:val="24"/>
-          <w:lang w:val="en-US"/>
-        </w:rPr>
-        <w:t>pi.hThread</w:t>
-      </w:r>
-      <w:proofErr w:type="spellEnd"/>
-      <w:proofErr w:type="gramEnd"/>
-      <w:r>
-        <w:rPr>
-          <w:rFonts w:ascii="Times New Roman" w:eastAsia="Times New Roman" w:hAnsi="Times New Roman" w:cs="Times New Roman"/>
-          <w:sz w:val="24"/>
-          <w:szCs w:val="24"/>
-          <w:lang w:val="en-US"/>
-        </w:rPr>
-        <w:t>);</w:t>
-      </w:r>
-    </w:p>
-    <w:p>
-      <w:pPr>
-        <w:pStyle w:val="ad"/>
-        <w:rPr>
-          <w:rFonts w:ascii="Times New Roman" w:eastAsia="Times New Roman" w:hAnsi="Times New Roman" w:cs="Times New Roman"/>
-          <w:sz w:val="24"/>
-          <w:szCs w:val="24"/>
-          <w:lang w:val="en-US"/>
-        </w:rPr>
-      </w:pPr>
-      <w:proofErr w:type="spellStart"/>
-      <w:r>
-        <w:rPr>
-          <w:rFonts w:ascii="Times New Roman" w:eastAsia="Times New Roman" w:hAnsi="Times New Roman" w:cs="Times New Roman"/>
-          <w:sz w:val="24"/>
-          <w:szCs w:val="24"/>
-          <w:lang w:val="en-US"/>
-        </w:rPr>
-        <w:t>CloseHandle</w:t>
-      </w:r>
-      <w:proofErr w:type="spellEnd"/>
-      <w:r>
-        <w:rPr>
-          <w:rFonts w:ascii="Times New Roman" w:eastAsia="Times New Roman" w:hAnsi="Times New Roman" w:cs="Times New Roman"/>
-          <w:sz w:val="24"/>
-          <w:szCs w:val="24"/>
-          <w:lang w:val="en-US"/>
-        </w:rPr>
-        <w:t>(</w:t>
-      </w:r>
-      <w:proofErr w:type="spellStart"/>
-      <w:r>
-        <w:rPr>
-          <w:rFonts w:ascii="Times New Roman" w:eastAsia="Times New Roman" w:hAnsi="Times New Roman" w:cs="Times New Roman"/>
-          <w:sz w:val="24"/>
-          <w:szCs w:val="24"/>
-          <w:lang w:val="en-US"/>
-        </w:rPr>
-        <w:t>pipeRead</w:t>
-      </w:r>
-      <w:proofErr w:type="spellEnd"/>
-      <w:r>
-        <w:rPr>
-          <w:rFonts w:ascii="Times New Roman" w:eastAsia="Times New Roman" w:hAnsi="Times New Roman" w:cs="Times New Roman"/>
-          <w:sz w:val="24"/>
-          <w:szCs w:val="24"/>
-          <w:lang w:val="en-US"/>
-        </w:rPr>
-        <w:t>);</w:t>
-      </w:r>
-    </w:p>
-    <w:p>
-      <w:pPr>
-        <w:pStyle w:val="ad"/>
-        <w:rPr>
-          <w:lang w:val="en-US"/>
-        </w:rPr>
-      </w:pPr>
     </w:p>
     <w:p>
       <w:pPr>
         <w:spacing w:after="120"/>
-        <w:rPr>
-          <w:lang w:val="en-US"/>
-        </w:rPr>
-      </w:pPr>
-    </w:p>
-    <w:p>
-      <w:pPr>
-        <w:spacing w:after="120"/>
-        <w:rPr>
-          <w:lang w:val="en-US"/>
-        </w:rPr>
       </w:pPr>
     </w:p>
     <w:p>
       <w:pPr>
         <w:pStyle w:val="1"/>
-        <w:rPr>
-          <w:lang w:val="en-US"/>
-        </w:rPr>
       </w:pPr>
       <w:r>
         <w:t>Результаты</w:t>
@@ -3586,9 +3396,13 @@
           <w:rFonts w:ascii="Times New Roman" w:eastAsia="Times New Roman" w:hAnsi="Times New Roman" w:cs="Times New Roman"/>
           <w:sz w:val="24"/>
           <w:szCs w:val="24"/>
+          <w:lang w:val="en-US"/>
         </w:rPr>
       </w:pPr>
       <w:r>
+        <w:rPr>
+          <w:lang w:val="en-US"/>
+        </w:rPr>
         <w:t xml:space="preserve"> </w:t>
       </w:r>
       <w:r>
@@ -3598,6 +3412,9 @@
         <w:t>Enter</w:t>
       </w:r>
       <w:r>
+        <w:rPr>
+          <w:lang w:val="en-US"/>
+        </w:rPr>
         <w:t xml:space="preserve"> </w:t>
       </w:r>
       <w:r>
@@ -3607,6 +3424,9 @@
         <w:t>for</w:t>
       </w:r>
       <w:r>
+        <w:rPr>
+          <w:lang w:val="en-US"/>
+        </w:rPr>
         <w:t xml:space="preserve"> </w:t>
       </w:r>
       <w:r>
@@ -3619,30 +3439,45 @@
         <w:t>Для</w:t>
       </w:r>
       <w:r>
+        <w:rPr>
+          <w:lang w:val="en-US"/>
+        </w:rPr>
         <w:t xml:space="preserve"> </w:t>
       </w:r>
       <w:r>
         <w:t>продолжения</w:t>
       </w:r>
       <w:r>
+        <w:rPr>
+          <w:lang w:val="en-US"/>
+        </w:rPr>
         <w:t xml:space="preserve"> </w:t>
       </w:r>
       <w:r>
         <w:t>нажмите</w:t>
       </w:r>
       <w:r>
+        <w:rPr>
+          <w:lang w:val="en-US"/>
+        </w:rPr>
         <w:t xml:space="preserve"> </w:t>
       </w:r>
       <w:r>
         <w:t>любую</w:t>
       </w:r>
       <w:r>
+        <w:rPr>
+          <w:lang w:val="en-US"/>
+        </w:rPr>
         <w:t xml:space="preserve"> </w:t>
       </w:r>
       <w:r>
         <w:t>клавишу</w:t>
       </w:r>
       <w:r>
+        <w:rPr>
+          <w:lang w:val="en-US"/>
+        </w:rPr>
         <w:t xml:space="preserve"> . . .</w:t>
       </w:r>
     </w:p>
@@ -3651,13 +3486,7 @@
         <w:pStyle w:val="1"/>
       </w:pPr>
       <w:r>
-        <w:t>Д</w:t>
-      </w:r>
-      <w:r>
-        <w:t>е</w:t>
-      </w:r>
-      <w:r>
-        <w:t>монстрация</w:t>
+        <w:t>Демонстрация</w:t>
       </w:r>
       <w:r>
         <w:t xml:space="preserve"> </w:t>
@@ -3731,9 +3560,6 @@
         </w:tabs>
         <w:spacing w:after="0"/>
         <w:jc w:val="left"/>
-        <w:rPr>
-          <w:lang w:val="en-US"/>
-        </w:rPr>
       </w:pPr>
     </w:p>
     <w:tbl>
@@ -4296,7 +4122,6 @@
         <w:rPr>
           <w:rStyle w:val="ae"/>
           <w:color w:val="auto"/>
-          <w:lang w:val="en-US"/>
         </w:rPr>
       </w:pPr>
       <w:r>
@@ -4381,19 +4206,13 @@
       </w:r>
       <w:proofErr w:type="spellEnd"/>
       <w:r>
-        <w:t xml:space="preserve">, где родитель перенаправляет ввод потомка на файл, а вывод забирает себе через пайп и печатает результаты деления чисел. </w:t>
-      </w:r>
-      <w:r>
-        <w:t>Работа корректна</w:t>
+        <w:t>, где родитель перенаправляет ввод потомка на файл, а вывод забирает себе через пайп и печатает результаты деления чисел. Работа корректна</w:t>
       </w:r>
       <w:r>
         <w:t>,</w:t>
       </w:r>
       <w:r>
-        <w:t xml:space="preserve"> потому что</w:t>
-      </w:r>
-      <w:r>
-        <w:t xml:space="preserve"> данные нормально доходят до конца файла, а при делении на ноль программа не падает, а выводит ошибку и штатно завершается. </w:t>
+        <w:t xml:space="preserve"> потому что данные нормально доходят до конца файла, а при делении на ноль программа не падает, а выводит ошибку и штатно завершается. </w:t>
       </w:r>
     </w:p>
     <w:p>
@@ -10352,6 +10171,7 @@
                 <w:rFonts w:ascii="Cascadia Mono" w:hAnsi="Cascadia Mono" w:cs="Cascadia Mono"/>
                 <w:sz w:val="19"/>
                 <w:szCs w:val="19"/>
+                <w:lang w:val="en-US"/>
               </w:rPr>
             </w:pPr>
             <w:r>
@@ -10369,6 +10189,7 @@
                 <w:rFonts w:ascii="Cascadia Mono" w:hAnsi="Cascadia Mono" w:cs="Cascadia Mono"/>
                 <w:sz w:val="19"/>
                 <w:szCs w:val="19"/>
+                <w:lang w:val="en-US"/>
               </w:rPr>
               <w:t>fflush</w:t>
             </w:r>
@@ -10378,6 +10199,7 @@
                 <w:rFonts w:ascii="Cascadia Mono" w:hAnsi="Cascadia Mono" w:cs="Cascadia Mono"/>
                 <w:sz w:val="19"/>
                 <w:szCs w:val="19"/>
+                <w:lang w:val="en-US"/>
               </w:rPr>
               <w:t>(</w:t>
             </w:r>
@@ -10387,6 +10209,7 @@
                 <w:rFonts w:ascii="Cascadia Mono" w:hAnsi="Cascadia Mono" w:cs="Cascadia Mono"/>
                 <w:sz w:val="19"/>
                 <w:szCs w:val="19"/>
+                <w:lang w:val="en-US"/>
               </w:rPr>
               <w:t>stdout</w:t>
             </w:r>
@@ -10396,6 +10219,7 @@
                 <w:rFonts w:ascii="Cascadia Mono" w:hAnsi="Cascadia Mono" w:cs="Cascadia Mono"/>
                 <w:sz w:val="19"/>
                 <w:szCs w:val="19"/>
+                <w:lang w:val="en-US"/>
               </w:rPr>
               <w:t>);</w:t>
             </w:r>
@@ -10417,8 +10241,17 @@
                 <w:rFonts w:ascii="Cascadia Mono" w:hAnsi="Cascadia Mono" w:cs="Cascadia Mono"/>
                 <w:sz w:val="19"/>
                 <w:szCs w:val="19"/>
-              </w:rPr>
-              <w:t xml:space="preserve">    }</w:t>
+                <w:lang w:val="en-US"/>
+              </w:rPr>
+              <w:t xml:space="preserve">    </w:t>
+            </w:r>
+            <w:r>
+              <w:rPr>
+                <w:rFonts w:ascii="Cascadia Mono" w:hAnsi="Cascadia Mono" w:cs="Cascadia Mono"/>
+                <w:sz w:val="19"/>
+                <w:szCs w:val="19"/>
+              </w:rPr>
+              <w:t>}</w:t>
             </w:r>
           </w:p>
           <w:p>
@@ -10711,14 +10544,7 @@
           <w:rStyle w:val="ae"/>
           <w:color w:val="auto"/>
         </w:rPr>
-        <w:t xml:space="preserve"> без сокращений</w:t>
-      </w:r>
-      <w:r>
-        <w:rPr>
-          <w:rStyle w:val="ae"/>
-          <w:color w:val="auto"/>
-        </w:rPr>
-        <w:t xml:space="preserve"> для запуска из раздела «Демонстрация работы </w:t>
+        <w:t xml:space="preserve"> без сокращений для запуска из раздела «Демонстрация работы </w:t>
       </w:r>
       <w:proofErr w:type="spellStart"/>
       <w:r>
@@ -18061,8 +17887,6 @@
             </w:r>
           </w:p>
         </w:tc>
-        <w:bookmarkStart w:id="0" w:name="_GoBack"/>
-        <w:bookmarkEnd w:id="0"/>
       </w:tr>
     </w:tbl>
     <w:p>
@@ -18374,7 +18198,6 @@
   </w:num>
   <w:num w:numId="3">
     <w:abstractNumId w:val="1"/>
-    <w:lvlOverride w:ilvl="0"/>
   </w:num>
 </w:numbering>
 </file>
@@ -18885,6 +18708,7 @@
   <w:style w:type="character" w:default="1" w:styleId="a0">
     <w:name w:val="Default Paragraph Font"/>
     <w:uiPriority w:val="1"/>
+    <w:semiHidden/>
     <w:unhideWhenUsed/>
   </w:style>
   <w:style w:type="table" w:default="1" w:styleId="a1">

</xml_diff>